<commit_message>
Pilot results, anonymized metadata, proposal and appendix drafts
Co-Authored-By: Claude Fable 5.1 <noreply@anthropic.com>
</commit_message>
<xml_diff>
--- a/docs/reference.docx
+++ b/docs/reference.docx
@@ -564,7 +564,7 @@
     <w:name w:val="Normal"/>
     <w:qFormat/>
     <w:pPr>
-      <w:spacing w:after="120" w:line="276" w:lineRule="auto"/>
+      <w:spacing w:after="0" w:line="480" w:lineRule="auto"/>
     </w:pPr>
     <w:rPr>
       <w:rFonts w:ascii="Times New Roman" w:hAnsi="Times New Roman" w:eastAsia="Times New Roman" w:cs="Times New Roman"/>
@@ -577,7 +577,7 @@
     <w:basedOn w:val="Normal"/>
     <w:link w:val="BodyTextChar"/>
     <w:pPr>
-      <w:spacing w:before="180" w:after="120" w:line="276" w:lineRule="auto"/>
+      <w:spacing w:before="180" w:after="0" w:line="480" w:lineRule="auto"/>
     </w:pPr>
     <w:qFormat/>
     <w:rPr>
@@ -592,7 +592,7 @@
     <w:next w:val="BodyText"/>
     <w:qFormat/>
     <w:pPr>
-      <w:spacing w:after="120" w:line="276" w:lineRule="auto"/>
+      <w:spacing w:after="0" w:line="480" w:lineRule="auto"/>
     </w:pPr>
     <w:rPr>
       <w:rFonts w:ascii="Times New Roman" w:hAnsi="Times New Roman" w:eastAsia="Times New Roman" w:cs="Times New Roman"/>
@@ -605,7 +605,7 @@
     <w:basedOn w:val="BodyText"/>
     <w:qFormat/>
     <w:pPr>
-      <w:spacing w:before="36" w:after="120" w:line="276" w:lineRule="auto"/>
+      <w:spacing w:before="36" w:after="40" w:line="240" w:lineRule="auto"/>
     </w:pPr>
     <w:rPr>
       <w:rFonts w:ascii="Times New Roman" w:hAnsi="Times New Roman" w:eastAsia="Times New Roman" w:cs="Times New Roman"/>
@@ -730,7 +730,7 @@
     <w:next w:val="Bibliography"/>
     <w:qFormat/>
     <w:pPr>
-      <w:spacing w:after="120" w:line="276" w:lineRule="auto"/>
+      <w:spacing w:after="40" w:line="240" w:lineRule="auto"/>
     </w:pPr>
     <w:rPr>
       <w:rFonts w:ascii="Times New Roman" w:hAnsi="Times New Roman" w:eastAsia="Times New Roman" w:cs="Times New Roman"/>

</xml_diff>